<commit_message>
feat: package KONEPS historical Kaggle release
</commit_message>
<xml_diff>
--- a/docs/generated/DATA_DICTIONARY.en.docx
+++ b/docs/generated/DATA_DICTIONARY.en.docx
@@ -4325,12 +4325,12 @@
         <w:pStyle w:val="Heading1"/>
       </w:pPr>
       <w:r>
-        <w:t>6. Curated Relational Tables (CURATED_SCHEMA_VERSION = "1.0.0")</w:t>
+        <w:t>6. Curated / Public Relational Tables (CURATED_SCHEMA_VERSION = "1.1.0")</w:t>
       </w:r>
     </w:p>
     <w:p>
       <w:r>
-        <w:t>Schema specifications for the 7 normalized relational tables generated under data/processed/curated/YYYY_MM/.</w:t>
+        <w:t>The row counts below describe the 2025-09-01 through 2026-08-31 public Kaggle payload. Monthly curated outputs are restartable verification units; scripts/build_kaggle_release.py merges them into seven ZSTD Parquet files. Supplier company names and business registration numbers are excluded from the public payload.</w:t>
       </w:r>
     </w:p>
     <w:p>
@@ -4354,7 +4354,7 @@
         <w:pStyle w:val="ListBullet"/>
       </w:pPr>
       <w:r>
-        <w:t>Row Count: 32,895 rows (August 2026, 100% unique)</w:t>
+        <w:t>Row Count: 470,937 rows</w:t>
       </w:r>
     </w:p>
     <w:p>
@@ -4394,7 +4394,7 @@
         <w:pStyle w:val="ListBullet"/>
       </w:pPr>
       <w:r>
-        <w:t>Row Count: 2,107,948 rows (August 2026)</w:t>
+        <w:t>Row Count: 35,907,867 rows</w:t>
       </w:r>
     </w:p>
     <w:p>
@@ -4450,7 +4450,7 @@
         <w:pStyle w:val="ListBullet"/>
       </w:pPr>
       <w:r>
-        <w:t>bid_rate_pct: bid rate relative to scheduled price (float64, %)</w:t>
+        <w:t>bid_rate: bid rate relative to the source reference price (float64, %)</w:t>
       </w:r>
     </w:p>
     <w:p>
@@ -4514,7 +4514,7 @@
         <w:pStyle w:val="ListBullet"/>
       </w:pPr>
       <w:r>
-        <w:t>Row Count: 17,315 rows (all selected winners)</w:t>
+        <w:t>Row Count: 305,995 rows (selected winners)</w:t>
       </w:r>
     </w:p>
     <w:p>
@@ -4522,7 +4522,7 @@
         <w:pStyle w:val="ListBullet"/>
       </w:pPr>
       <w:r>
-        <w:t>Award Amount Null Policy: Exactly 24 rows (0.14%) have NULL award_amount_krw due to unfinalized post-opening adjudication. Preserved as NULL per DO NOT IMPUTE policy.</w:t>
+        <w:t>Award Amount Null Policy: 280 award_amount_krw values are NULL in the source snapshot and are preserved as observed. No administrative cause is inferred from missingness alone; the release applies a DO NOT IMPUTE policy.</w:t>
       </w:r>
     </w:p>
     <w:p>
@@ -4570,7 +4570,7 @@
         <w:pStyle w:val="ListBullet"/>
       </w:pPr>
       <w:r>
-        <w:t>award_amount_krw: final contract award amount (float64, Nullable in 24 cases)</w:t>
+        <w:t>award_amount_krw: final award amount (float64, Nullable)</w:t>
       </w:r>
     </w:p>
     <w:p>
@@ -4634,7 +4634,7 @@
         <w:pStyle w:val="ListBullet"/>
       </w:pPr>
       <w:r>
-        <w:t>Row Count: 115,945 rows</w:t>
+        <w:t>Row Count: 1,894,598 rows</w:t>
       </w:r>
     </w:p>
     <w:p>
@@ -4642,7 +4642,15 @@
         <w:pStyle w:val="ListBullet"/>
       </w:pPr>
       <w:r>
-        <w:t>Key Columns: unified_contract_no, contract_no, contract_round, contract_title_ko, contract_date, contract_method_ko, total_contract_amount_krw, contract_amount_krw, contract_agency_code, contract_agency_name_ko, demand_agency_code, demand_agency_name_ko, contractor_supplier_id (FK), contractor_name_ko, bid_notice_no, bid_notice_round, contract_period, is_joint_contract</w:t>
+        <w:t>Key Columns: unified_contract_no, contract_no, contract_round, contract_title_ko, contract_date, contract_method_ko, total_contract_amount_krw, contract_amount_krw, contract_agency_code, contract_agency_name_ko, demand_agency_code, demand_agency_name_ko, contractor_supplier_id (FK), bid_notice_no, bid_notice_round, contract_period, is_joint_contract</w:t>
+      </w:r>
+    </w:p>
+    <w:p>
+      <w:pPr>
+        <w:pStyle w:val="ListBullet"/>
+      </w:pPr>
+      <w:r>
+        <w:t>Amount Anomaly Policy: Negative contract amounts verified in source JSON are preserved rather than deleted or coerced to zero.</w:t>
       </w:r>
     </w:p>
     <w:p>
@@ -4666,7 +4674,7 @@
         <w:pStyle w:val="ListBullet"/>
       </w:pPr>
       <w:r>
-        <w:t>Row Count: 143,842 enterprises (consolidated across bidders, winners, and contractors)</w:t>
+        <w:t>Row Count: 261,474 pseudonymized supplier IDs (consolidated across bidders, winners, and contractors)</w:t>
       </w:r>
     </w:p>
     <w:p>
@@ -4674,7 +4682,7 @@
         <w:pStyle w:val="ListBullet"/>
       </w:pPr>
       <w:r>
-        <w:t>Privacy Preservation: Zero raw business registration numbers; masked string (masked_biz_no: 123-45-*) provided.</w:t>
+        <w:t>Privacy Preservation: Raw business registration numbers, masked business registration numbers, and supplier company names are all excluded from the public payload. supplier_id is an HMAC-SHA256 identifier generated with a dedicated secret.</w:t>
       </w:r>
     </w:p>
     <w:p>
@@ -4698,22 +4706,6 @@
         <w:pStyle w:val="ListBullet"/>
       </w:pPr>
       <w:r>
-        <w:t>supplier_name_ko: registered company name (string)</w:t>
-      </w:r>
-    </w:p>
-    <w:p>
-      <w:pPr>
-        <w:pStyle w:val="ListBullet"/>
-      </w:pPr>
-      <w:r>
-        <w:t>masked_biz_no: masked business registration number (123-45-*)</w:t>
-      </w:r>
-    </w:p>
-    <w:p>
-      <w:pPr>
-        <w:pStyle w:val="ListBullet"/>
-      </w:pPr>
-      <w:r>
         <w:t>is_bidder, is_winner, is_contractor: participation role flags (boolean)</w:t>
       </w:r>
     </w:p>
@@ -4722,7 +4714,7 @@
         <w:pStyle w:val="ListBullet"/>
       </w:pPr>
       <w:r>
-        <w:t>total_bids_in_scope, total_wins_in_scope, total_contracts_in_scope: monthly activity counts (int64)</w:t>
+        <w:t>snapshot_total_bids_in_scope, snapshot_total_wins_in_scope, snapshot_total_contracts_in_scope: activity counts across the 12-month public scope (int64)</w:t>
       </w:r>
     </w:p>
     <w:p>
@@ -4730,7 +4722,15 @@
         <w:pStyle w:val="ListBullet"/>
       </w:pPr>
       <w:r>
-        <w:t>total_contract_amount_krw: monthly total contracted amount (float64)</w:t>
+        <w:t>snapshot_total_contract_amount_krw: contracted amount across the 12-month public scope (float64)</w:t>
+      </w:r>
+    </w:p>
+    <w:p>
+      <w:pPr>
+        <w:pStyle w:val="ListBullet"/>
+      </w:pPr>
+      <w:r>
+        <w:t>ML Warning: snapshot_total_* fields aggregate the full release window and must not be used directly as leak-free historical prediction features.</w:t>
       </w:r>
     </w:p>
     <w:p>
@@ -4754,7 +4754,7 @@
         <w:pStyle w:val="ListBullet"/>
       </w:pPr>
       <w:r>
-        <w:t>Row Count: 14,091 public entities</w:t>
+        <w:t>Row Count: 27,214 public entities</w:t>
       </w:r>
     </w:p>
     <w:p>
@@ -4794,7 +4794,7 @@
         <w:pStyle w:val="ListBullet"/>
       </w:pPr>
       <w:r>
-        <w:t>total_tenders_in_scope, total_contracts_in_scope: monthly procurement activity counts (int64)</w:t>
+        <w:t>snapshot_total_tenders_in_scope, snapshot_total_contracts_in_scope: procurement activity counts across the 12-month public scope (int64)</w:t>
       </w:r>
     </w:p>
     <w:p>
@@ -4818,7 +4818,7 @@
         <w:pStyle w:val="ListBullet"/>
       </w:pPr>
       <w:r>
-        <w:t>Row Count: 40,677 rows (100% of tender-linked contracts; 75,268 unlinked contracts excluded)</w:t>
+        <w:t>Row Count: 637,107 tender-contract links for contracts containing a tender notice reference</w:t>
       </w:r>
     </w:p>
     <w:p>
@@ -4874,7 +4874,12 @@
         <w:pStyle w:val="ListBullet"/>
       </w:pPr>
       <w:r>
-        <w:t>contractor_supplier_id: contractor reference (FK → suppliers)</w:t>
+        <w:t>match_type: tender-contract linkage type (string)</w:t>
+      </w:r>
+    </w:p>
+    <w:p>
+      <w:r>
+        <w:t>See HISTORICAL_RELEASE_2025_09_2026_08.en.md and docs/metrics/release_202509_202608.json for the full release validation and per-file SHA-256 receipts.</w:t>
       </w:r>
     </w:p>
     <w:sectPr>

</xml_diff>